<commit_message>
Fix leftover red text in BAPP II PML template
Same issue as the Pernyataan/BAST templates: 32 text runs (mostly around
"...atau usaha besar." and the "Screenshoot Aplikasi Fasih" labels) were
still colored red from the source document, now black. Checked every other
SE2026 template (BAPP I/II PCL, BAPP I PML, Pernyataan Kepala) - none of
them have leftover red text. Also verified BAPP's multi-page output (4-6
pages depending on role) is the template's original intended structure
(separate lampiran + screenshot sections for door-to-door vs usaha besar),
not something that should be 1 page like Surat Pernyataan.

Co-Authored-By: Claude Sonnet 5 <noreply@anthropic.com>
</commit_message>
<xml_diff>
--- a/static/templates-se2026/bapp_termin2_pml_se2026.docx
+++ b/static/templates-se2026/bapp_termin2_pml_se2026.docx
@@ -1849,16 +1849,16 @@
       <w:r>
         <w:rPr>
           <w:rFonts w:ascii="Bookman Old Style" w:eastAsia="Bookman Old Style" w:hAnsi="Bookman Old Style" w:cs="Bookman Old Style"/>
-          <w:color w:val="FF0000"/>
-          <w:sz w:val="24"/>
-          <w:szCs w:val="24"/>
-        </w:rPr>
-      </w:r>
-      <w:proofErr w:type="spellStart"/>
-      <w:r>
-        <w:rPr>
-          <w:rFonts w:ascii="Bookman Old Style" w:eastAsia="Bookman Old Style" w:hAnsi="Bookman Old Style" w:cs="Bookman Old Style"/>
-          <w:color w:val="FF0000"/>
+          <w:color w:val="000000"/>
+          <w:sz w:val="24"/>
+          <w:szCs w:val="24"/>
+        </w:rPr>
+      </w:r>
+      <w:proofErr w:type="spellStart"/>
+      <w:r>
+        <w:rPr>
+          <w:rFonts w:ascii="Bookman Old Style" w:eastAsia="Bookman Old Style" w:hAnsi="Bookman Old Style" w:cs="Bookman Old Style"/>
+          <w:color w:val="000000"/>
           <w:sz w:val="24"/>
           <w:szCs w:val="24"/>
         </w:rPr>
@@ -1868,7 +1868,7 @@
       <w:r>
         <w:rPr>
           <w:rFonts w:ascii="Bookman Old Style" w:eastAsia="Bookman Old Style" w:hAnsi="Bookman Old Style" w:cs="Bookman Old Style"/>
-          <w:color w:val="FF0000"/>
+          <w:color w:val="000000"/>
           <w:sz w:val="24"/>
           <w:szCs w:val="24"/>
         </w:rPr>
@@ -1878,7 +1878,7 @@
       <w:r>
         <w:rPr>
           <w:rFonts w:ascii="Bookman Old Style" w:eastAsia="Bookman Old Style" w:hAnsi="Bookman Old Style" w:cs="Bookman Old Style"/>
-          <w:color w:val="FF0000"/>
+          <w:color w:val="000000"/>
           <w:sz w:val="24"/>
           <w:szCs w:val="24"/>
         </w:rPr>
@@ -1888,7 +1888,7 @@
       <w:r>
         <w:rPr>
           <w:rFonts w:ascii="Bookman Old Style" w:eastAsia="Bookman Old Style" w:hAnsi="Bookman Old Style" w:cs="Bookman Old Style"/>
-          <w:color w:val="FF0000"/>
+          <w:color w:val="000000"/>
           <w:sz w:val="24"/>
           <w:szCs w:val="24"/>
         </w:rPr>
@@ -1898,7 +1898,7 @@
       <w:r>
         <w:rPr>
           <w:rFonts w:ascii="Bookman Old Style" w:eastAsia="Bookman Old Style" w:hAnsi="Bookman Old Style" w:cs="Bookman Old Style"/>
-          <w:color w:val="FF0000"/>
+          <w:color w:val="000000"/>
           <w:sz w:val="24"/>
           <w:szCs w:val="24"/>
         </w:rPr>
@@ -1908,7 +1908,7 @@
       <w:r>
         <w:rPr>
           <w:rFonts w:ascii="Bookman Old Style" w:eastAsia="Bookman Old Style" w:hAnsi="Bookman Old Style" w:cs="Bookman Old Style"/>
-          <w:color w:val="FF0000"/>
+          <w:color w:val="000000"/>
           <w:sz w:val="24"/>
           <w:szCs w:val="24"/>
         </w:rPr>
@@ -3133,16 +3133,16 @@
       <w:r>
         <w:rPr>
           <w:rFonts w:ascii="Bookman Old Style" w:eastAsia="Bookman Old Style" w:hAnsi="Bookman Old Style" w:cs="Bookman Old Style"/>
-          <w:color w:val="FF0000"/>
-          <w:sz w:val="24"/>
-          <w:szCs w:val="24"/>
-        </w:rPr>
-      </w:r>
-      <w:proofErr w:type="spellStart"/>
-      <w:r>
-        <w:rPr>
-          <w:rFonts w:ascii="Bookman Old Style" w:eastAsia="Bookman Old Style" w:hAnsi="Bookman Old Style" w:cs="Bookman Old Style"/>
-          <w:color w:val="FF0000"/>
+          <w:color w:val="000000"/>
+          <w:sz w:val="24"/>
+          <w:szCs w:val="24"/>
+        </w:rPr>
+      </w:r>
+      <w:proofErr w:type="spellStart"/>
+      <w:r>
+        <w:rPr>
+          <w:rFonts w:ascii="Bookman Old Style" w:eastAsia="Bookman Old Style" w:hAnsi="Bookman Old Style" w:cs="Bookman Old Style"/>
+          <w:color w:val="000000"/>
           <w:sz w:val="24"/>
           <w:szCs w:val="24"/>
         </w:rPr>
@@ -3152,7 +3152,7 @@
       <w:r>
         <w:rPr>
           <w:rFonts w:ascii="Bookman Old Style" w:eastAsia="Bookman Old Style" w:hAnsi="Bookman Old Style" w:cs="Bookman Old Style"/>
-          <w:color w:val="FF0000"/>
+          <w:color w:val="000000"/>
           <w:sz w:val="24"/>
           <w:szCs w:val="24"/>
         </w:rPr>
@@ -3162,7 +3162,7 @@
       <w:r>
         <w:rPr>
           <w:rFonts w:ascii="Bookman Old Style" w:eastAsia="Bookman Old Style" w:hAnsi="Bookman Old Style" w:cs="Bookman Old Style"/>
-          <w:color w:val="FF0000"/>
+          <w:color w:val="000000"/>
           <w:sz w:val="24"/>
           <w:szCs w:val="24"/>
         </w:rPr>
@@ -3172,7 +3172,7 @@
       <w:r>
         <w:rPr>
           <w:rFonts w:ascii="Bookman Old Style" w:eastAsia="Bookman Old Style" w:hAnsi="Bookman Old Style" w:cs="Bookman Old Style"/>
-          <w:color w:val="FF0000"/>
+          <w:color w:val="000000"/>
           <w:sz w:val="24"/>
           <w:szCs w:val="24"/>
         </w:rPr>
@@ -3182,7 +3182,7 @@
       <w:r>
         <w:rPr>
           <w:rFonts w:ascii="Bookman Old Style" w:eastAsia="Bookman Old Style" w:hAnsi="Bookman Old Style" w:cs="Bookman Old Style"/>
-          <w:color w:val="FF0000"/>
+          <w:color w:val="000000"/>
           <w:sz w:val="24"/>
           <w:szCs w:val="24"/>
         </w:rPr>
@@ -3192,7 +3192,7 @@
       <w:r>
         <w:rPr>
           <w:rFonts w:ascii="Bookman Old Style" w:eastAsia="Bookman Old Style" w:hAnsi="Bookman Old Style" w:cs="Bookman Old Style"/>
-          <w:color w:val="FF0000"/>
+          <w:color w:val="000000"/>
           <w:sz w:val="24"/>
           <w:szCs w:val="24"/>
         </w:rPr>
@@ -5348,7 +5348,7 @@
                 <w:rFonts w:ascii="Bookman Old Style" w:eastAsia="Bookman Old Style" w:hAnsi="Bookman Old Style" w:cs="Bookman Old Style"/>
                 <w:i/>
                 <w:iCs/>
-                <w:color w:val="FF0000"/>
+                <w:color w:val="000000"/>
                 <w:sz w:val="24"/>
                 <w:szCs w:val="24"/>
                 <w:u w:val="single"/>
@@ -5358,7 +5358,7 @@
             <w:r>
               <w:rPr>
                 <w:rFonts w:ascii="Bookman Old Style" w:eastAsia="Bookman Old Style" w:hAnsi="Bookman Old Style" w:cs="Bookman Old Style"/>
-                <w:color w:val="FF0000"/>
+                <w:color w:val="000000"/>
                 <w:sz w:val="24"/>
                 <w:szCs w:val="24"/>
               </w:rPr>
@@ -5402,7 +5402,7 @@
               <w:jc w:val="center"/>
               <w:rPr>
                 <w:rFonts w:ascii="Bookman Old Style" w:eastAsia="Bookman Old Style" w:hAnsi="Bookman Old Style" w:cs="Bookman Old Style"/>
-                <w:color w:val="FF0000"/>
+                <w:color w:val="000000"/>
                 <w:sz w:val="24"/>
                 <w:szCs w:val="24"/>
               </w:rPr>
@@ -5490,7 +5490,7 @@
                 <w:rFonts w:ascii="Bookman Old Style" w:eastAsia="Bookman Old Style" w:hAnsi="Bookman Old Style" w:cs="Bookman Old Style"/>
                 <w:i/>
                 <w:iCs/>
-                <w:color w:val="FF0000"/>
+                <w:color w:val="000000"/>
                 <w:sz w:val="24"/>
                 <w:szCs w:val="24"/>
                 <w:u w:val="single"/>
@@ -5500,7 +5500,7 @@
             <w:r>
               <w:rPr>
                 <w:rFonts w:ascii="Bookman Old Style" w:eastAsia="Bookman Old Style" w:hAnsi="Bookman Old Style" w:cs="Bookman Old Style"/>
-                <w:color w:val="FF0000"/>
+                <w:color w:val="000000"/>
                 <w:sz w:val="24"/>
                 <w:szCs w:val="24"/>
               </w:rPr>
@@ -6006,16 +6006,16 @@
         <w:ind w:left="360"/>
         <w:rPr>
           <w:rFonts w:ascii="Bookman Old Style" w:eastAsia="Bookman Old Style" w:hAnsi="Bookman Old Style" w:cs="Bookman Old Style"/>
-          <w:color w:val="FF0000"/>
-          <w:sz w:val="24"/>
-          <w:szCs w:val="24"/>
-        </w:rPr>
-      </w:pPr>
-      <w:proofErr w:type="spellStart"/>
-      <w:r>
-        <w:rPr>
-          <w:rFonts w:ascii="Bookman Old Style" w:eastAsia="Bookman Old Style" w:hAnsi="Bookman Old Style" w:cs="Bookman Old Style"/>
-          <w:color w:val="FF0000"/>
+          <w:color w:val="000000"/>
+          <w:sz w:val="24"/>
+          <w:szCs w:val="24"/>
+        </w:rPr>
+      </w:pPr>
+      <w:proofErr w:type="spellStart"/>
+      <w:r>
+        <w:rPr>
+          <w:rFonts w:ascii="Bookman Old Style" w:eastAsia="Bookman Old Style" w:hAnsi="Bookman Old Style" w:cs="Bookman Old Style"/>
+          <w:color w:val="000000"/>
           <w:sz w:val="24"/>
           <w:szCs w:val="24"/>
         </w:rPr>
@@ -6025,7 +6025,7 @@
       <w:r>
         <w:rPr>
           <w:rFonts w:ascii="Bookman Old Style" w:eastAsia="Bookman Old Style" w:hAnsi="Bookman Old Style" w:cs="Bookman Old Style"/>
-          <w:color w:val="FF0000"/>
+          <w:color w:val="000000"/>
           <w:sz w:val="24"/>
           <w:szCs w:val="24"/>
         </w:rPr>
@@ -6035,7 +6035,7 @@
       <w:r>
         <w:rPr>
           <w:rFonts w:ascii="Bookman Old Style" w:eastAsia="Bookman Old Style" w:hAnsi="Bookman Old Style" w:cs="Bookman Old Style"/>
-          <w:color w:val="FF0000"/>
+          <w:color w:val="000000"/>
           <w:sz w:val="24"/>
           <w:szCs w:val="24"/>
         </w:rPr>
@@ -6045,7 +6045,7 @@
       <w:r>
         <w:rPr>
           <w:rFonts w:ascii="Bookman Old Style" w:eastAsia="Bookman Old Style" w:hAnsi="Bookman Old Style" w:cs="Bookman Old Style"/>
-          <w:color w:val="FF0000"/>
+          <w:color w:val="000000"/>
           <w:sz w:val="24"/>
           <w:szCs w:val="24"/>
         </w:rPr>
@@ -7753,7 +7753,7 @@
             <w:r>
               <w:rPr>
                 <w:rFonts w:ascii="Bookman Old Style" w:eastAsia="Bookman Old Style" w:hAnsi="Bookman Old Style" w:cs="Bookman Old Style"/>
-                <w:color w:val="FF0000"/>
+                <w:color w:val="000000"/>
                 <w:sz w:val="24"/>
                 <w:szCs w:val="24"/>
               </w:rPr>
@@ -7764,7 +7764,7 @@
                 <w:rFonts w:ascii="Bookman Old Style" w:eastAsia="Bookman Old Style" w:hAnsi="Bookman Old Style" w:cs="Bookman Old Style"/>
                 <w:i/>
                 <w:iCs/>
-                <w:color w:val="FF0000"/>
+                <w:color w:val="000000"/>
                 <w:sz w:val="24"/>
                 <w:szCs w:val="24"/>
               </w:rPr>
@@ -7773,7 +7773,7 @@
             <w:r>
               <w:rPr>
                 <w:rFonts w:ascii="Bookman Old Style" w:eastAsia="Bookman Old Style" w:hAnsi="Bookman Old Style" w:cs="Bookman Old Style"/>
-                <w:color w:val="FF0000"/>
+                <w:color w:val="000000"/>
                 <w:sz w:val="24"/>
                 <w:szCs w:val="24"/>
               </w:rPr>
@@ -8322,16 +8322,16 @@
         <w:ind w:left="360"/>
         <w:rPr>
           <w:rFonts w:ascii="Bookman Old Style" w:eastAsia="Bookman Old Style" w:hAnsi="Bookman Old Style" w:cs="Bookman Old Style"/>
-          <w:color w:val="FF0000"/>
-          <w:sz w:val="24"/>
-          <w:szCs w:val="24"/>
-        </w:rPr>
-      </w:pPr>
-      <w:proofErr w:type="spellStart"/>
-      <w:r>
-        <w:rPr>
-          <w:rFonts w:ascii="Bookman Old Style" w:eastAsia="Bookman Old Style" w:hAnsi="Bookman Old Style" w:cs="Bookman Old Style"/>
-          <w:color w:val="FF0000"/>
+          <w:color w:val="000000"/>
+          <w:sz w:val="24"/>
+          <w:szCs w:val="24"/>
+        </w:rPr>
+      </w:pPr>
+      <w:proofErr w:type="spellStart"/>
+      <w:r>
+        <w:rPr>
+          <w:rFonts w:ascii="Bookman Old Style" w:eastAsia="Bookman Old Style" w:hAnsi="Bookman Old Style" w:cs="Bookman Old Style"/>
+          <w:color w:val="000000"/>
           <w:sz w:val="24"/>
           <w:szCs w:val="24"/>
         </w:rPr>
@@ -8341,7 +8341,7 @@
       <w:r>
         <w:rPr>
           <w:rFonts w:ascii="Bookman Old Style" w:eastAsia="Bookman Old Style" w:hAnsi="Bookman Old Style" w:cs="Bookman Old Style"/>
-          <w:color w:val="FF0000"/>
+          <w:color w:val="000000"/>
           <w:sz w:val="24"/>
           <w:szCs w:val="24"/>
         </w:rPr>
@@ -8351,7 +8351,7 @@
       <w:r>
         <w:rPr>
           <w:rFonts w:ascii="Bookman Old Style" w:eastAsia="Bookman Old Style" w:hAnsi="Bookman Old Style" w:cs="Bookman Old Style"/>
-          <w:color w:val="FF0000"/>
+          <w:color w:val="000000"/>
           <w:sz w:val="24"/>
           <w:szCs w:val="24"/>
         </w:rPr>
@@ -8361,7 +8361,7 @@
       <w:r>
         <w:rPr>
           <w:rFonts w:ascii="Bookman Old Style" w:eastAsia="Bookman Old Style" w:hAnsi="Bookman Old Style" w:cs="Bookman Old Style"/>
-          <w:color w:val="FF0000"/>
+          <w:color w:val="000000"/>
           <w:sz w:val="24"/>
           <w:szCs w:val="24"/>
         </w:rPr>

</xml_diff>